<commit_message>
Add Red Lion logo branding (header, welcome dialog, certificate, favicon, docs)
</commit_message>
<xml_diff>
--- a/Verified Financials - Product and User Guide.docx
+++ b/Verified Financials - Product and User Guide.docx
@@ -2,6 +2,45 @@
 <file path=word/document.xml><?xml version="1.0" encoding="utf-8"?>
 <w:document xmlns:wpc="http://schemas.microsoft.com/office/word/2010/wordprocessingCanvas" xmlns:mo="http://schemas.microsoft.com/office/mac/office/2008/main" xmlns:mc="http://schemas.openxmlformats.org/markup-compatibility/2006" xmlns:mv="urn:schemas-microsoft-com:mac:vml" xmlns:o="urn:schemas-microsoft-com:office:office" xmlns:r="http://schemas.openxmlformats.org/officeDocument/2006/relationships" xmlns:m="http://schemas.openxmlformats.org/officeDocument/2006/math" xmlns:v="urn:schemas-microsoft-com:vml" xmlns:wp14="http://schemas.microsoft.com/office/word/2010/wordprocessingDrawing" xmlns:wp="http://schemas.openxmlformats.org/drawingml/2006/wordprocessingDrawing" xmlns:w10="urn:schemas-microsoft-com:office:word" xmlns:w="http://schemas.openxmlformats.org/wordprocessingml/2006/main" xmlns:w14="http://schemas.microsoft.com/office/word/2010/wordml" xmlns:wpg="http://schemas.microsoft.com/office/word/2010/wordprocessingGroup" xmlns:wpi="http://schemas.microsoft.com/office/word/2010/wordprocessingInk" xmlns:wne="http://schemas.microsoft.com/office/word/2006/wordml" xmlns:wps="http://schemas.microsoft.com/office/word/2010/wordprocessingShape" mc:Ignorable="w14 wp14">
   <w:body>
+    <w:p>
+      <w:pPr>
+        <w:spacing w:after="200"/>
+      </w:pPr>
+      <w:r>
+        <w:drawing>
+          <wp:inline xmlns:a="http://schemas.openxmlformats.org/drawingml/2006/main" xmlns:pic="http://schemas.openxmlformats.org/drawingml/2006/picture">
+            <wp:extent cx="2377440" cy="463601"/>
+            <wp:docPr id="1" name="Picture 1"/>
+            <wp:cNvGraphicFramePr>
+              <a:graphicFrameLocks noChangeAspect="1"/>
+            </wp:cNvGraphicFramePr>
+            <a:graphic>
+              <a:graphicData uri="http://schemas.openxmlformats.org/drawingml/2006/picture">
+                <pic:pic>
+                  <pic:nvPicPr>
+                    <pic:cNvPr id="0" name="red-lion-wordmark.png"/>
+                    <pic:cNvPicPr/>
+                  </pic:nvPicPr>
+                  <pic:blipFill>
+                    <a:blip r:embed="rId9"/>
+                    <a:stretch>
+                      <a:fillRect/>
+                    </a:stretch>
+                  </pic:blipFill>
+                  <pic:spPr>
+                    <a:xfrm>
+                      <a:off x="0" y="0"/>
+                      <a:ext cx="2377440" cy="463601"/>
+                    </a:xfrm>
+                    <a:prstGeom prst="rect"/>
+                  </pic:spPr>
+                </pic:pic>
+              </a:graphicData>
+            </a:graphic>
+          </wp:inline>
+        </w:drawing>
+      </w:r>
+    </w:p>
     <w:p>
       <w:pPr>
         <w:jc w:val="left"/>
@@ -110,7 +149,7 @@
         <w:drawing>
           <wp:inline xmlns:a="http://schemas.openxmlformats.org/drawingml/2006/main" xmlns:pic="http://schemas.openxmlformats.org/drawingml/2006/picture">
             <wp:extent cx="5760720" cy="3100388"/>
-            <wp:docPr id="1" name="Picture 1"/>
+            <wp:docPr id="2" name="Picture 2"/>
             <wp:cNvGraphicFramePr>
               <a:graphicFrameLocks noChangeAspect="1"/>
             </wp:cNvGraphicFramePr>
@@ -122,7 +161,7 @@
                     <pic:cNvPicPr/>
                   </pic:nvPicPr>
                   <pic:blipFill>
-                    <a:blip r:embed="rId9"/>
+                    <a:blip r:embed="rId10"/>
                     <a:stretch>
                       <a:fillRect/>
                     </a:stretch>
@@ -279,7 +318,7 @@
         <w:drawing>
           <wp:inline xmlns:a="http://schemas.openxmlformats.org/drawingml/2006/main" xmlns:pic="http://schemas.openxmlformats.org/drawingml/2006/picture">
             <wp:extent cx="5760720" cy="4096939"/>
-            <wp:docPr id="2" name="Picture 2"/>
+            <wp:docPr id="3" name="Picture 3"/>
             <wp:cNvGraphicFramePr>
               <a:graphicFrameLocks noChangeAspect="1"/>
             </wp:cNvGraphicFramePr>
@@ -291,7 +330,7 @@
                     <pic:cNvPicPr/>
                   </pic:nvPicPr>
                   <pic:blipFill>
-                    <a:blip r:embed="rId10"/>
+                    <a:blip r:embed="rId11"/>
                     <a:stretch>
                       <a:fillRect/>
                     </a:stretch>
@@ -434,7 +473,7 @@
         <w:drawing>
           <wp:inline xmlns:a="http://schemas.openxmlformats.org/drawingml/2006/main" xmlns:pic="http://schemas.openxmlformats.org/drawingml/2006/picture">
             <wp:extent cx="5760720" cy="4099800"/>
-            <wp:docPr id="3" name="Picture 3"/>
+            <wp:docPr id="4" name="Picture 4"/>
             <wp:cNvGraphicFramePr>
               <a:graphicFrameLocks noChangeAspect="1"/>
             </wp:cNvGraphicFramePr>
@@ -446,7 +485,7 @@
                     <pic:cNvPicPr/>
                   </pic:nvPicPr>
                   <pic:blipFill>
-                    <a:blip r:embed="rId11"/>
+                    <a:blip r:embed="rId12"/>
                     <a:stretch>
                       <a:fillRect/>
                     </a:stretch>
@@ -536,7 +575,7 @@
         <w:drawing>
           <wp:inline xmlns:a="http://schemas.openxmlformats.org/drawingml/2006/main" xmlns:pic="http://schemas.openxmlformats.org/drawingml/2006/picture">
             <wp:extent cx="5605221" cy="4206240"/>
-            <wp:docPr id="4" name="Picture 4"/>
+            <wp:docPr id="5" name="Picture 5"/>
             <wp:cNvGraphicFramePr>
               <a:graphicFrameLocks noChangeAspect="1"/>
             </wp:cNvGraphicFramePr>
@@ -548,7 +587,7 @@
                     <pic:cNvPicPr/>
                   </pic:nvPicPr>
                   <pic:blipFill>
-                    <a:blip r:embed="rId12"/>
+                    <a:blip r:embed="rId13"/>
                     <a:stretch>
                       <a:fillRect/>
                     </a:stretch>
@@ -732,7 +771,7 @@
         <w:drawing>
           <wp:inline xmlns:a="http://schemas.openxmlformats.org/drawingml/2006/main" xmlns:pic="http://schemas.openxmlformats.org/drawingml/2006/picture">
             <wp:extent cx="1438263" cy="4206240"/>
-            <wp:docPr id="5" name="Picture 5"/>
+            <wp:docPr id="6" name="Picture 6"/>
             <wp:cNvGraphicFramePr>
               <a:graphicFrameLocks noChangeAspect="1"/>
             </wp:cNvGraphicFramePr>
@@ -744,7 +783,7 @@
                     <pic:cNvPicPr/>
                   </pic:nvPicPr>
                   <pic:blipFill>
-                    <a:blip r:embed="rId13"/>
+                    <a:blip r:embed="rId14"/>
                     <a:stretch>
                       <a:fillRect/>
                     </a:stretch>
@@ -889,7 +928,7 @@
         <w:drawing>
           <wp:inline xmlns:a="http://schemas.openxmlformats.org/drawingml/2006/main" xmlns:pic="http://schemas.openxmlformats.org/drawingml/2006/picture">
             <wp:extent cx="5446021" cy="4206240"/>
-            <wp:docPr id="6" name="Picture 6"/>
+            <wp:docPr id="7" name="Picture 7"/>
             <wp:cNvGraphicFramePr>
               <a:graphicFrameLocks noChangeAspect="1"/>
             </wp:cNvGraphicFramePr>
@@ -901,7 +940,7 @@
                     <pic:cNvPicPr/>
                   </pic:nvPicPr>
                   <pic:blipFill>
-                    <a:blip r:embed="rId14"/>
+                    <a:blip r:embed="rId15"/>
                     <a:stretch>
                       <a:fillRect/>
                     </a:stretch>
@@ -942,7 +981,7 @@
         <w:drawing>
           <wp:inline xmlns:a="http://schemas.openxmlformats.org/drawingml/2006/main" xmlns:pic="http://schemas.openxmlformats.org/drawingml/2006/picture">
             <wp:extent cx="5440975" cy="4206240"/>
-            <wp:docPr id="7" name="Picture 7"/>
+            <wp:docPr id="8" name="Picture 8"/>
             <wp:cNvGraphicFramePr>
               <a:graphicFrameLocks noChangeAspect="1"/>
             </wp:cNvGraphicFramePr>
@@ -954,7 +993,7 @@
                     <pic:cNvPicPr/>
                   </pic:nvPicPr>
                   <pic:blipFill>
-                    <a:blip r:embed="rId15"/>
+                    <a:blip r:embed="rId16"/>
                     <a:stretch>
                       <a:fillRect/>
                     </a:stretch>
@@ -1075,7 +1114,7 @@
         <w:drawing>
           <wp:inline xmlns:a="http://schemas.openxmlformats.org/drawingml/2006/main" xmlns:pic="http://schemas.openxmlformats.org/drawingml/2006/picture">
             <wp:extent cx="5485410" cy="4206240"/>
-            <wp:docPr id="8" name="Picture 8"/>
+            <wp:docPr id="9" name="Picture 9"/>
             <wp:cNvGraphicFramePr>
               <a:graphicFrameLocks noChangeAspect="1"/>
             </wp:cNvGraphicFramePr>
@@ -1087,7 +1126,7 @@
                     <pic:cNvPicPr/>
                   </pic:nvPicPr>
                   <pic:blipFill>
-                    <a:blip r:embed="rId16"/>
+                    <a:blip r:embed="rId17"/>
                     <a:stretch>
                       <a:fillRect/>
                     </a:stretch>

</xml_diff>